<commit_message>
docs(iso42001): update Ch1-3 draft + generate_docx script
Carries across iso42001 EXECUTION_PLAN.md edits and regenerated
Ch1-3 CLEAN/FILLED .docx from latest DRAFT.md.
</commit_message>
<xml_diff>
--- a/docs/iso42001/ISO42001_Report_Ch1-3_CLEAN.docx
+++ b/docs/iso42001/ISO42001_Report_Ch1-3_CLEAN.docx
@@ -2738,7 +2738,7 @@
               <w:br/>
               <w:t>• Lifecycle: Design through educational deployment on HuggingFace Spaces</w:t>
               <w:br/>
-              <w:t>• Data: 20 published, de-identified clinical datasets (UCI, Kaggle, PhysioNet, Harvard Dataverse) + user-uploaded CSV files</w:t>
+              <w:t>• Data: 20 published, de-identified clinical datasets (UCI, Kaggle, PhysioNet, Harvard Dataverse) — 18 bundled in Docker, 2 auto-downloaded at runtime due to unverified redistribution rights. Full licensing audit in DATA_LICENSES.md and ATTRIBUTION.md. + user-uploaded CSV files</w:t>
               <w:br/>
               <w:t>• Explainability: SHAP-based global feature importance and single-patient waterfall with 251 clinical name mappings</w:t>
               <w:br/>
@@ -4878,7 +4878,7 @@
                 <w:sz w:val="16"/>
                 <w:szCs w:val="16"/>
               </w:rPr>
-              <w:t>Provenance documentation in Section 3.1; educational-use scope; license compliance in Section 3.4</w:t>
+              <w:t>Provenance in Section 3.1; DATA_LICENSES.md (per-dataset license categories, DOIs, redistribution rights); ATTRIBUTION.md (CC BY/CC BY-SA attributions); Section 3.4</w:t>
             </w:r>
           </w:p>
         </w:tc>
@@ -7469,7 +7469,7 @@
                 <w:sz w:val="15"/>
                 <w:szCs w:val="15"/>
               </w:rPr>
-              <w:t>Heart Failure Clinical Records (Kaggle)</w:t>
+              <w:t>Heart Failure Clinical Records (Kaggle, CC BY 4.0)</w:t>
             </w:r>
           </w:p>
         </w:tc>
@@ -7605,7 +7605,7 @@
                 <w:sz w:val="15"/>
                 <w:szCs w:val="15"/>
               </w:rPr>
-              <w:t>Small sample; ~32% death class imbalance; single-centre (Pakistan); limited demographics</w:t>
+              <w:t>Small sample; ~32% death class imbalance; single-centre (Pakistan); limited demographics. Bundled.</w:t>
             </w:r>
           </w:p>
         </w:tc>
@@ -7708,7 +7708,7 @@
                 <w:sz w:val="15"/>
                 <w:szCs w:val="15"/>
               </w:rPr>
-              <w:t>Stroke Prediction Dataset (Kaggle)</w:t>
+              <w:t>Stroke Prediction Dataset (Kaggle, No license)</w:t>
             </w:r>
           </w:p>
         </w:tc>
@@ -7844,7 +7844,7 @@
                 <w:sz w:val="15"/>
                 <w:szCs w:val="15"/>
               </w:rPr>
-              <w:t>Severe imbalance (&lt;5% positive); self-reported data; socioeconomic proxies</w:t>
+              <w:t>Severe imbalance (&lt;5% positive); self-reported data; socioeconomic proxies. NOT bundled — auto-downloaded at runtime.</w:t>
             </w:r>
           </w:p>
         </w:tc>
@@ -7943,7 +7943,7 @@
                 <w:b w:val="0"/>
                 <w:i w:val="0"/>
               </w:rPr>
-              <w:t>UCI Arrhythmia Dataset (UCI)</w:t>
+              <w:t>UCI Arrhythmia Dataset (UCI, CC BY 4.0)</w:t>
             </w:r>
           </w:p>
         </w:tc>
@@ -8063,7 +8063,7 @@
                 <w:b w:val="0"/>
                 <w:i w:val="0"/>
               </w:rPr>
-              <w:t>High dimensionality; significant missing values; 1980s–90s data; binarised from 16 classes</w:t>
+              <w:t>High dimensionality; significant missing values; 1980s–90s data; binarised from 16 classes. Bundled.</w:t>
             </w:r>
           </w:p>
         </w:tc>
@@ -8107,7 +8107,7 @@
               <w:rPr>
                 <w:sz w:val="18"/>
               </w:rPr>
-              <w:t>NIH Chest X-Ray Metadata (Kaggle)</w:t>
+              <w:t>NIH Chest X-Ray Metadata (Kaggle, CC0 1.0)</w:t>
             </w:r>
           </w:p>
         </w:tc>
@@ -8163,7 +8163,7 @@
               <w:rPr>
                 <w:sz w:val="18"/>
               </w:rPr>
-              <w:t>Metadata only (no images); NLP-extracted labels with noise; institutional bias</w:t>
+              <w:t>Metadata only (no images); NLP-extracted labels with noise; institutional bias. Bundled.</w:t>
             </w:r>
           </w:p>
         </w:tc>
@@ -8207,7 +8207,7 @@
               <w:rPr>
                 <w:sz w:val="18"/>
               </w:rPr>
-              <w:t>UCI CKD Dataset (UCI)</w:t>
+              <w:t>UCI CKD Dataset (UCI, CC BY 4.0)</w:t>
             </w:r>
           </w:p>
         </w:tc>
@@ -8263,7 +8263,7 @@
               <w:rPr>
                 <w:sz w:val="18"/>
               </w:rPr>
-              <w:t>Significant missing values; single-centre (India); small sample for 15 features</w:t>
+              <w:t>Significant missing values; single-centre (India); small sample for 15 features. Bundled.</w:t>
             </w:r>
           </w:p>
         </w:tc>
@@ -8307,7 +8307,7 @@
               <w:rPr>
                 <w:sz w:val="18"/>
               </w:rPr>
-              <w:t>Breast Cancer Wisconsin (UCI)</w:t>
+              <w:t>Breast Cancer Wisconsin (UCI, CC BY 4.0)</w:t>
             </w:r>
           </w:p>
         </w:tc>
@@ -8363,7 +8363,7 @@
               <w:rPr>
                 <w:sz w:val="18"/>
               </w:rPr>
-              <w:t>FNA-derived features; ~37% malignant; single institution; lacks demographics</w:t>
+              <w:t>FNA-derived features; ~37% malignant; single institution; lacks demographics. Bundled.</w:t>
             </w:r>
           </w:p>
         </w:tc>
@@ -8407,7 +8407,7 @@
               <w:rPr>
                 <w:sz w:val="18"/>
               </w:rPr>
-              <w:t>Cervical Cancer Risk Factors (UCI)</w:t>
+              <w:t>Cervical Cancer Risk Factors (UCI, CC BY 4.0)</w:t>
             </w:r>
           </w:p>
         </w:tc>
@@ -8463,7 +8463,7 @@
               <w:rPr>
                 <w:sz w:val="18"/>
               </w:rPr>
-              <w:t>Extensive missing values; &lt;10% positive; self-reported behavioural data; single country</w:t>
+              <w:t>Extensive missing values; &lt;10% positive; self-reported behavioural data; single country. Bundled.</w:t>
             </w:r>
           </w:p>
         </w:tc>
@@ -8507,7 +8507,7 @@
               <w:rPr>
                 <w:sz w:val="18"/>
               </w:rPr>
-              <w:t>UCI Parkinson's Dataset (UCI)</w:t>
+              <w:t>UCI Parkinson's Dataset (UCI, CC BY 4.0)</w:t>
             </w:r>
           </w:p>
         </w:tc>
@@ -8563,7 +8563,7 @@
               <w:rPr>
                 <w:sz w:val="18"/>
               </w:rPr>
-              <w:t>Very small (n=195); ~75% PD positive; voice-only features; single session</w:t>
+              <w:t>Very small (n=195); ~75% PD positive; voice-only features; single session. Bundled.</w:t>
             </w:r>
           </w:p>
         </w:tc>
@@ -8607,7 +8607,7 @@
               <w:rPr>
                 <w:sz w:val="18"/>
               </w:rPr>
-              <w:t>Pima Indians Diabetes (Kaggle)</w:t>
+              <w:t>Pima Indians Diabetes (Kaggle, CC0/CC BY 4.0)</w:t>
             </w:r>
           </w:p>
         </w:tc>
@@ -8663,7 +8663,7 @@
               <w:rPr>
                 <w:sz w:val="18"/>
               </w:rPr>
-              <w:t>Only Pima Indian women ≥21; zero values = missing; severely limits generalisability</w:t>
+              <w:t>Only Pima Indian women ≥21; zero values = missing; severely limits generalisability. Bundled.</w:t>
             </w:r>
           </w:p>
         </w:tc>
@@ -8707,7 +8707,7 @@
               <w:rPr>
                 <w:sz w:val="18"/>
               </w:rPr>
-              <w:t>UCI New Thyroid Dataset (UCI)</w:t>
+              <w:t>UCI New Thyroid Dataset (UCI, CC BY 4.0)</w:t>
             </w:r>
           </w:p>
         </w:tc>
@@ -8763,7 +8763,7 @@
               <w:rPr>
                 <w:sz w:val="18"/>
               </w:rPr>
-              <w:t>Very small (n=215); only 5 features; 1980s data; reference ranges may differ</w:t>
+              <w:t>Very small (n=215); only 5 features; 1980s data; reference ranges may differ. Bundled.</w:t>
             </w:r>
           </w:p>
         </w:tc>
@@ -8807,7 +8807,7 @@
               <w:rPr>
                 <w:sz w:val="18"/>
               </w:rPr>
-              <w:t>Indian Liver Patient (UCI)</w:t>
+              <w:t>Indian Liver Patient (UCI, CC BY 4.0)</w:t>
             </w:r>
           </w:p>
         </w:tc>
@@ -8863,7 +8863,7 @@
               <w:rPr>
                 <w:sz w:val="18"/>
               </w:rPr>
-              <w:t>Single country (India); 75% male; ~72% positive; no aetiology info</w:t>
+              <w:t>Single country (India); 75% male; ~72% positive; no aetiology info. Bundled.</w:t>
             </w:r>
           </w:p>
         </w:tc>
@@ -8907,7 +8907,7 @@
               <w:rPr>
                 <w:sz w:val="18"/>
               </w:rPr>
-              <w:t>Depression Dataset (Kaggle)</w:t>
+              <w:t>Depression Dataset (Kaggle, CC BY-SA 4.0)</w:t>
             </w:r>
           </w:p>
         </w:tc>
@@ -8963,7 +8963,7 @@
               <w:rPr>
                 <w:sz w:val="18"/>
               </w:rPr>
-              <w:t>Self-reported; oversimplifies severity; no DSM-5 criteria; weak provenance — used as pedagogical example</w:t>
+              <w:t>Self-reported; oversimplifies severity; no DSM-5 criteria; weak provenance — pedagogical example. ShareAlike applies. Bundled.</w:t>
             </w:r>
           </w:p>
         </w:tc>
@@ -9007,7 +9007,7 @@
               <w:rPr>
                 <w:sz w:val="18"/>
               </w:rPr>
-              <w:t>COPD EHR Dataset (PhysioNet)</w:t>
+              <w:t>COPD Student Dataset (Kaggle, CC0 1.0)</w:t>
             </w:r>
           </w:p>
         </w:tc>
@@ -9021,7 +9021,7 @@
               <w:rPr>
                 <w:sz w:val="18"/>
               </w:rPr>
-              <w:t>~1,000</w:t>
+              <w:t>101</w:t>
             </w:r>
           </w:p>
         </w:tc>
@@ -9063,7 +9063,7 @@
               <w:rPr>
                 <w:sz w:val="18"/>
               </w:rPr>
-              <w:t>Credentialed access required; documentation bias; spirometry effort-dependent</w:t>
+              <w:t>Very small sample (n=101); compiled from UCL Datasets Library; spirometry effort-dependent. Bundled.</w:t>
             </w:r>
           </w:p>
         </w:tc>
@@ -9107,7 +9107,7 @@
               <w:rPr>
                 <w:sz w:val="18"/>
               </w:rPr>
-              <w:t>Anaemia Detection Dataset (Kaggle)</w:t>
+              <w:t>Anaemia Detection Dataset (Kaggle, Unknown)</w:t>
             </w:r>
           </w:p>
         </w:tc>
@@ -9121,7 +9121,7 @@
               <w:rPr>
                 <w:sz w:val="18"/>
               </w:rPr>
-              <w:t>~1,421</w:t>
+              <w:t>~400</w:t>
             </w:r>
           </w:p>
         </w:tc>
@@ -9149,7 +9149,7 @@
               <w:rPr>
                 <w:sz w:val="18"/>
               </w:rPr>
-              <w:t>anemia_type (binary)</w:t>
+              <w:t>anemia_type (multiclass)</w:t>
             </w:r>
           </w:p>
         </w:tc>
@@ -9163,7 +9163,7 @@
               <w:rPr>
                 <w:sz w:val="18"/>
               </w:rPr>
-              <w:t>Only 5 features; no iron/ferritin/B12; binary — no subtype distinction</w:t>
+              <w:t>Only 5 features (Hb, MCV, MCH, MCHC, gender); no iron/ferritin/B12; multiclass (iron deficiency, megaloblastic, normocytic, normal). NOT bundled — license unverified; auto-downloaded at runtime.</w:t>
             </w:r>
           </w:p>
         </w:tc>
@@ -9207,7 +9207,7 @@
               <w:rPr>
                 <w:sz w:val="18"/>
               </w:rPr>
-              <w:t>HAM10000 Metadata (Harvard Dataverse)</w:t>
+              <w:t>HAM10000 Metadata (Harvard Dataverse, CC BY-NC 4.0)</w:t>
             </w:r>
           </w:p>
         </w:tc>
@@ -9263,7 +9263,7 @@
               <w:rPr>
                 <w:sz w:val="18"/>
               </w:rPr>
-              <w:t>Metadata only; 3 features; ~10% melanoma; predominantly light-skinned (Vienna, Queensland)</w:t>
+              <w:t>Metadata only; 3 features; ~10% melanoma; predominantly light-skinned (Vienna, Queensland). Non-commercial use only. Bundled.</w:t>
             </w:r>
           </w:p>
         </w:tc>
@@ -9307,7 +9307,7 @@
               <w:rPr>
                 <w:sz w:val="18"/>
               </w:rPr>
-              <w:t>Diabetic Retinopathy Debrecen (UCI)</w:t>
+              <w:t>Diabetic Retinopathy Debrecen (UCI, CC BY 4.0)</w:t>
             </w:r>
           </w:p>
         </w:tc>
@@ -9363,7 +9363,7 @@
               <w:rPr>
                 <w:sz w:val="18"/>
               </w:rPr>
-              <w:t>Automated image features; single institution (Hungary); binarised from multi-grade</w:t>
+              <w:t>Automated image features; single institution (Hungary); binarised from multi-grade. Bundled.</w:t>
             </w:r>
           </w:p>
         </w:tc>
@@ -9407,7 +9407,7 @@
               <w:rPr>
                 <w:sz w:val="18"/>
               </w:rPr>
-              <w:t>Vertebral Column Dataset (UCI)</w:t>
+              <w:t>Vertebral Column Dataset (UCI, CC BY 4.0)</w:t>
             </w:r>
           </w:p>
         </w:tc>
@@ -9463,7 +9463,7 @@
               <w:rPr>
                 <w:sz w:val="18"/>
               </w:rPr>
-              <w:t>Only 6 features; small (n=310); no age/gender; examiner-dependent measurements</w:t>
+              <w:t>Only 6 features; small (n=310); no age/gender; examiner-dependent measurements. Bundled.</w:t>
             </w:r>
           </w:p>
         </w:tc>
@@ -9507,7 +9507,7 @@
               <w:rPr>
                 <w:sz w:val="18"/>
               </w:rPr>
-              <w:t>PhysioNet Sepsis Challenge 2019</w:t>
+              <w:t>PhysioNet Sepsis Challenge 2019 (CC BY 4.0)</w:t>
             </w:r>
           </w:p>
         </w:tc>
@@ -9563,7 +9563,7 @@
               <w:rPr>
                 <w:sz w:val="18"/>
               </w:rPr>
-              <w:t>~10% positive; missing values clinically meaningful; credentialed access required</w:t>
+              <w:t>~10% positive; missing values clinically meaningful; credentialed access. Bundled.</w:t>
             </w:r>
           </w:p>
         </w:tc>
@@ -9607,7 +9607,7 @@
               <w:rPr>
                 <w:sz w:val="18"/>
               </w:rPr>
-              <w:t>Cardiotocography Dataset (UCI)</w:t>
+              <w:t>Cardiotocography Dataset (UCI, CC BY 4.0)</w:t>
             </w:r>
           </w:p>
         </w:tc>
@@ -9663,7 +9663,7 @@
               <w:rPr>
                 <w:sz w:val="18"/>
               </w:rPr>
-              <w:t>~8% pathological; inter-observer variability; software-derived features</w:t>
+              <w:t>~8% pathological; inter-observer variability; software-derived features. Bundled.</w:t>
             </w:r>
           </w:p>
         </w:tc>
@@ -9707,7 +9707,7 @@
               <w:rPr>
                 <w:sz w:val="18"/>
               </w:rPr>
-              <w:t>Diabetes 130-US Hospitals (UCI)</w:t>
+              <w:t>Diabetes 130-US Hospitals (UCI, CC BY 4.0)</w:t>
             </w:r>
           </w:p>
         </w:tc>
@@ -9763,7 +9763,7 @@
               <w:rPr>
                 <w:sz w:val="18"/>
               </w:rPr>
-              <w:t>1999–2008 data; US-specific; encounter-level; outdated treatment protocols</w:t>
+              <w:t>1999–2008 data; US-specific; encounter-level; outdated treatment protocols. Bundled.</w:t>
             </w:r>
           </w:p>
         </w:tc>
@@ -10675,7 +10675,11 @@
                 <w:sz w:val="17"/>
                 <w:szCs w:val="17"/>
               </w:rPr>
-              <w:t>• Built-in datasets: Source URL, description, and license in specialty registry. Step 2 displays dataset attribution.</w:t>
+              <w:t>• Built-in datasets: Source URL, description, license type, and DOI in specialty registry. Step 2 displays dataset attribution.</w:t>
+              <w:br/>
+              <w:t>• Licensing documentation: DATA_LICENSES.md provides full per-dataset inventory with license categories, DOIs, citations, modification records, redistribution rights, and EU AI Act Art. 10/11/52 compliance tables (ISO/IEC 25012 compliant). ATTRIBUTION.md lists required CC BY/CC BY-SA attributions.</w:t>
+              <w:br/>
+              <w:t>• Docker bundling: 18/20 datasets bundled based on verified redistribution rights. 2 datasets (Stroke, Anaemia) auto-downloaded at runtime — licenses unverified.</w:t>
               <w:br/>
               <w:t>• User uploads: filename, row/column counts, types, class distribution captured per session. No persistent lineage (educational scope).</w:t>
               <w:br/>
@@ -12138,7 +12142,7 @@
                 <w:sz w:val="14"/>
                 <w:szCs w:val="14"/>
               </w:rPr>
-              <w:t>Academic origin (Lundberg); 18k+ citations; transitive deps</w:t>
+              <w:t>Academic origin (Lundberg); 18k+ citations; transitive dep chain (NumPy/SciPy) increases vulnerability surface; not enterprise-backed</w:t>
             </w:r>
           </w:p>
         </w:tc>
@@ -12171,7 +12175,7 @@
                 <w:sz w:val="14"/>
                 <w:szCs w:val="14"/>
               </w:rPr>
-              <w:t>L</w:t>
+              <w:t>M</w:t>
             </w:r>
           </w:p>
         </w:tc>
@@ -12237,7 +12241,7 @@
                 <w:sz w:val="14"/>
                 <w:szCs w:val="14"/>
               </w:rPr>
-              <w:t>Pin version; monitor API changes</w:t>
+              <w:t>Pin version; monitor API changes; scan transitive deps with pip-audit</w:t>
             </w:r>
           </w:p>
         </w:tc>
@@ -12695,7 +12699,7 @@
                 <w:sz w:val="14"/>
                 <w:szCs w:val="14"/>
               </w:rPr>
-              <w:t>scikit-learn-contrib; well-tested SMOTE; quarterly releases</w:t>
+              <w:t>scikit-learn-contrib; quarterly releases = slower patches; directly affects training output via synthetic data</w:t>
             </w:r>
           </w:p>
         </w:tc>
@@ -12728,7 +12732,7 @@
                 <w:sz w:val="14"/>
                 <w:szCs w:val="14"/>
               </w:rPr>
-              <w:t>L</w:t>
+              <w:t>M</w:t>
             </w:r>
           </w:p>
         </w:tc>
@@ -12794,7 +12798,7 @@
                 <w:sz w:val="14"/>
                 <w:szCs w:val="14"/>
               </w:rPr>
-              <w:t>Pin; follows sklearn cycle</w:t>
+              <w:t>Pin exact version; verify SMOTE output consistency across upgrades</w:t>
             </w:r>
           </w:p>
         </w:tc>
@@ -13710,7 +13714,7 @@
               <w:rPr>
                 <w:sz w:val="18"/>
               </w:rPr>
-              <w:t>Official image; regular security rebuilds; slim variant</w:t>
+              <w:t>Official image; regular rebuilds; slim still ships ~80MB system pkgs (glibc, openssl) whose CVEs propagate</w:t>
             </w:r>
           </w:p>
         </w:tc>
@@ -13724,7 +13728,7 @@
               <w:rPr>
                 <w:sz w:val="18"/>
               </w:rPr>
-              <w:t>L</w:t>
+              <w:t>M</w:t>
             </w:r>
           </w:p>
         </w:tc>
@@ -13752,7 +13756,7 @@
               <w:rPr>
                 <w:sz w:val="18"/>
               </w:rPr>
-              <w:t>Rebuild on advisories; scan with Trivy</w:t>
+              <w:t>Rebuild on advisories; scan with Trivy/Docker Scout; monitor Debian tracker</w:t>
             </w:r>
           </w:p>
         </w:tc>

</xml_diff>